<commit_message>
Release prep: cut 1.1.1
</commit_message>
<xml_diff>
--- a/WordPress-Security-Benchmark.docx
+++ b/WordPress-Security-Benchmark.docx
@@ -23,7 +23,7 @@
         <w:pStyle w:val="Date"/>
       </w:pPr>
       <w:r>
-        <w:t xml:space="preserve">June 14, 2026</w:t>
+        <w:t xml:space="preserve">June 17, 2026</w:t>
       </w:r>
     </w:p>
     <w:sdt>
@@ -52,7 +52,7 @@
         </w:p>
       </w:sdtContent>
     </w:sdt>
-    <w:bookmarkStart w:id="20" w:name="overview"/>
+    <w:bookmarkStart w:id="40" w:name="overview"/>
     <w:p>
       <w:pPr>
         <w:pStyle w:val="Heading2"/>
@@ -93,8 +93,8 @@
         <w:t xml:space="preserve">The Benchmark is intended for system administrators, security engineers, DevOps teams, and WordPress developers responsible for deploying and maintaining WordPress installations in enterprise environments. It draws on many WordPress, LEMP/LAMP, and related security resources and standards (e.g., OWASP and NIST), as well as field experience with enterprise WordPress hardening.</w:t>
       </w:r>
     </w:p>
-    <w:bookmarkEnd w:id="20"/>
-    <w:bookmarkStart w:id="23" w:name="target-technology"/>
+    <w:bookmarkEnd w:id="40"/>
+    <w:bookmarkStart w:id="43" w:name="target-technology"/>
     <w:p>
       <w:pPr>
         <w:pStyle w:val="Heading2"/>
@@ -175,7 +175,7 @@
       <w:r>
         <w:t xml:space="preserve">While this benchmark assumes a traditional Linux stack, the principles and many of the configuration settings apply equally to containerized environments (</w:t>
       </w:r>
-      <w:hyperlink r:id="rId21">
+      <w:hyperlink r:id="rId41">
         <w:r>
           <w:rPr>
             <w:rStyle w:val="Hyperlink"/>
@@ -189,7 +189,7 @@
       <w:r>
         <w:t xml:space="preserve"> </w:t>
       </w:r>
-      <w:hyperlink r:id="rId22">
+      <w:hyperlink r:id="rId42">
         <w:r>
           <w:rPr>
             <w:rStyle w:val="Hyperlink"/>
@@ -201,8 +201,8 @@
         <w:t xml:space="preserve">). In such cases, configurations should be injected via environment variables or secret management systems rather than direct file edits where possible.</w:t>
       </w:r>
     </w:p>
-    <w:bookmarkEnd w:id="23"/>
-    <w:bookmarkStart w:id="24" w:name="profile-definitions"/>
+    <w:bookmarkEnd w:id="43"/>
+    <w:bookmarkStart w:id="44" w:name="profile-definitions"/>
     <w:p>
       <w:pPr>
         <w:pStyle w:val="Heading2"/>
@@ -320,8 +320,8 @@
         </w:tc>
       </w:tr>
     </w:tbl>
-    <w:bookmarkEnd w:id="24"/>
-    <w:bookmarkStart w:id="25" w:name="assessment-status"/>
+    <w:bookmarkEnd w:id="44"/>
+    <w:bookmarkStart w:id="45" w:name="assessment-status"/>
     <w:p>
       <w:pPr>
         <w:pStyle w:val="Heading2"/>
@@ -366,8 +366,8 @@
         <w:t xml:space="preserve">Compliance requires human judgment, review of policies, or inspection of settings through a graphical interface.</w:t>
       </w:r>
     </w:p>
-    <w:bookmarkEnd w:id="25"/>
-    <w:bookmarkStart w:id="41" w:name="web-server-configuration"/>
+    <w:bookmarkEnd w:id="45"/>
+    <w:bookmarkStart w:id="61" w:name="web-server-configuration"/>
     <w:p>
       <w:pPr>
         <w:pStyle w:val="Heading2"/>
@@ -384,7 +384,7 @@
         <w:t xml:space="preserve">This section provides recommendations for hardening the web server (Nginx or Apache) that serves the WordPress application.</w:t>
       </w:r>
     </w:p>
-    <w:bookmarkStart w:id="27" w:name="ensure-tls-1.2-is-enforced"/>
+    <w:bookmarkStart w:id="47" w:name="ensure-tls-1.2-is-enforced"/>
     <w:p>
       <w:pPr>
         <w:pStyle w:val="Heading4"/>
@@ -743,7 +743,7 @@
           <w:numId w:val="1002"/>
         </w:numPr>
       </w:pPr>
-      <w:hyperlink r:id="rId26">
+      <w:hyperlink r:id="rId46">
         <w:r>
           <w:rPr>
             <w:rStyle w:val="Hyperlink"/>
@@ -759,8 +759,8 @@
         </w:pict>
       </w:r>
     </w:p>
-    <w:bookmarkEnd w:id="27"/>
-    <w:bookmarkStart w:id="30" w:name="Xcabf1d9e350adbbe6b47c08be11d7e0be4d42f7"/>
+    <w:bookmarkEnd w:id="47"/>
+    <w:bookmarkStart w:id="50" w:name="Xcabf1d9e350adbbe6b47c08be11d7e0be4d42f7"/>
     <w:p>
       <w:pPr>
         <w:pStyle w:val="Heading4"/>
@@ -1096,7 +1096,7 @@
           <w:numId w:val="1003"/>
         </w:numPr>
       </w:pPr>
-      <w:hyperlink r:id="rId28">
+      <w:hyperlink r:id="rId48">
         <w:r>
           <w:rPr>
             <w:rStyle w:val="Hyperlink"/>
@@ -1113,7 +1113,7 @@
           <w:numId w:val="1003"/>
         </w:numPr>
       </w:pPr>
-      <w:hyperlink r:id="rId29">
+      <w:hyperlink r:id="rId49">
         <w:r>
           <w:rPr>
             <w:rStyle w:val="Hyperlink"/>
@@ -1129,8 +1129,8 @@
         </w:pict>
       </w:r>
     </w:p>
-    <w:bookmarkEnd w:id="30"/>
-    <w:bookmarkStart w:id="34" w:name="X6cf1bca182238ea7b4dd9f990ff6176c91549fd"/>
+    <w:bookmarkEnd w:id="50"/>
+    <w:bookmarkStart w:id="54" w:name="X6cf1bca182238ea7b4dd9f990ff6176c91549fd"/>
     <w:p>
       <w:pPr>
         <w:pStyle w:val="Heading4"/>
@@ -1385,7 +1385,7 @@
           <w:numId w:val="1004"/>
         </w:numPr>
       </w:pPr>
-      <w:hyperlink r:id="rId31">
+      <w:hyperlink r:id="rId51">
         <w:r>
           <w:rPr>
             <w:rStyle w:val="Hyperlink"/>
@@ -1426,7 +1426,7 @@
           <w:numId w:val="1004"/>
         </w:numPr>
       </w:pPr>
-      <w:hyperlink r:id="rId32">
+      <w:hyperlink r:id="rId52">
         <w:r>
           <w:rPr>
             <w:rStyle w:val="Hyperlink"/>
@@ -1467,7 +1467,7 @@
           <w:numId w:val="1004"/>
         </w:numPr>
       </w:pPr>
-      <w:hyperlink r:id="rId33">
+      <w:hyperlink r:id="rId53">
         <w:r>
           <w:rPr>
             <w:rStyle w:val="Hyperlink"/>
@@ -1507,8 +1507,8 @@
         </w:pict>
       </w:r>
     </w:p>
-    <w:bookmarkEnd w:id="34"/>
-    <w:bookmarkStart w:id="36" w:name="Xce5bdfe2b3d49dd0bb8c871502cfae68921f71e"/>
+    <w:bookmarkEnd w:id="54"/>
+    <w:bookmarkStart w:id="56" w:name="Xce5bdfe2b3d49dd0bb8c871502cfae68921f71e"/>
     <w:p>
       <w:pPr>
         <w:pStyle w:val="Heading4"/>
@@ -1792,7 +1792,7 @@
           <w:numId w:val="1005"/>
         </w:numPr>
       </w:pPr>
-      <w:hyperlink r:id="rId35">
+      <w:hyperlink r:id="rId55">
         <w:r>
           <w:rPr>
             <w:rStyle w:val="Hyperlink"/>
@@ -1808,8 +1808,8 @@
         </w:pict>
       </w:r>
     </w:p>
-    <w:bookmarkEnd w:id="36"/>
-    <w:bookmarkStart w:id="40" w:name="X2df13cc8d6ddfeb1c3086783e1108c782e81db3"/>
+    <w:bookmarkEnd w:id="56"/>
+    <w:bookmarkStart w:id="60" w:name="X2df13cc8d6ddfeb1c3086783e1108c782e81db3"/>
     <w:p>
       <w:pPr>
         <w:pStyle w:val="Heading4"/>
@@ -2212,7 +2212,7 @@
           <w:numId w:val="1006"/>
         </w:numPr>
       </w:pPr>
-      <w:hyperlink r:id="rId37">
+      <w:hyperlink r:id="rId57">
         <w:r>
           <w:rPr>
             <w:rStyle w:val="Hyperlink"/>
@@ -2229,7 +2229,7 @@
           <w:numId w:val="1006"/>
         </w:numPr>
       </w:pPr>
-      <w:hyperlink r:id="rId38">
+      <w:hyperlink r:id="rId58">
         <w:r>
           <w:rPr>
             <w:rStyle w:val="Hyperlink"/>
@@ -2270,7 +2270,7 @@
           <w:numId w:val="1006"/>
         </w:numPr>
       </w:pPr>
-      <w:hyperlink r:id="rId39">
+      <w:hyperlink r:id="rId59">
         <w:r>
           <w:rPr>
             <w:rStyle w:val="Hyperlink"/>
@@ -2286,9 +2286,9 @@
         </w:pict>
       </w:r>
     </w:p>
-    <w:bookmarkEnd w:id="40"/>
-    <w:bookmarkEnd w:id="41"/>
-    <w:bookmarkStart w:id="55" w:name="php-configuration"/>
+    <w:bookmarkEnd w:id="60"/>
+    <w:bookmarkEnd w:id="61"/>
+    <w:bookmarkStart w:id="75" w:name="php-configuration"/>
     <w:p>
       <w:pPr>
         <w:pStyle w:val="Heading2"/>
@@ -2305,7 +2305,7 @@
         <w:t xml:space="preserve">This section provides recommendations for securing the PHP runtime environment.</w:t>
       </w:r>
     </w:p>
-    <w:bookmarkStart w:id="44" w:name="ensure-expose_php-is-disabled"/>
+    <w:bookmarkStart w:id="64" w:name="ensure-expose_php-is-disabled"/>
     <w:p>
       <w:pPr>
         <w:pStyle w:val="Heading4"/>
@@ -2528,7 +2528,7 @@
           <w:numId w:val="1007"/>
         </w:numPr>
       </w:pPr>
-      <w:hyperlink r:id="rId42">
+      <w:hyperlink r:id="rId62">
         <w:r>
           <w:rPr>
             <w:rStyle w:val="Hyperlink"/>
@@ -2569,7 +2569,7 @@
           <w:numId w:val="1007"/>
         </w:numPr>
       </w:pPr>
-      <w:hyperlink r:id="rId43">
+      <w:hyperlink r:id="rId63">
         <w:r>
           <w:rPr>
             <w:rStyle w:val="Hyperlink"/>
@@ -2585,8 +2585,8 @@
         </w:pict>
       </w:r>
     </w:p>
-    <w:bookmarkEnd w:id="44"/>
-    <w:bookmarkStart w:id="48" w:name="X6d8545390b8ff6f86e463d23dc04788800728c6"/>
+    <w:bookmarkEnd w:id="64"/>
+    <w:bookmarkStart w:id="68" w:name="X6d8545390b8ff6f86e463d23dc04788800728c6"/>
     <w:p>
       <w:pPr>
         <w:pStyle w:val="Heading4"/>
@@ -2823,7 +2823,7 @@
           <w:numId w:val="1008"/>
         </w:numPr>
       </w:pPr>
-      <w:hyperlink r:id="rId45">
+      <w:hyperlink r:id="rId65">
         <w:r>
           <w:rPr>
             <w:rStyle w:val="Hyperlink"/>
@@ -2864,7 +2864,7 @@
           <w:numId w:val="1008"/>
         </w:numPr>
       </w:pPr>
-      <w:hyperlink r:id="rId46">
+      <w:hyperlink r:id="rId66">
         <w:r>
           <w:rPr>
             <w:rStyle w:val="Hyperlink"/>
@@ -2881,7 +2881,7 @@
           <w:numId w:val="1008"/>
         </w:numPr>
       </w:pPr>
-      <w:hyperlink r:id="rId47">
+      <w:hyperlink r:id="rId67">
         <w:r>
           <w:rPr>
             <w:rStyle w:val="Hyperlink"/>
@@ -2921,8 +2921,8 @@
         </w:pict>
       </w:r>
     </w:p>
-    <w:bookmarkEnd w:id="48"/>
-    <w:bookmarkStart w:id="50" w:name="X6766e48cbff5daaa4af97004511b8d9ff4d7796"/>
+    <w:bookmarkEnd w:id="68"/>
+    <w:bookmarkStart w:id="70" w:name="X6766e48cbff5daaa4af97004511b8d9ff4d7796"/>
     <w:p>
       <w:pPr>
         <w:pStyle w:val="Heading4"/>
@@ -3216,7 +3216,7 @@
           <w:numId w:val="1009"/>
         </w:numPr>
       </w:pPr>
-      <w:hyperlink r:id="rId49">
+      <w:hyperlink r:id="rId69">
         <w:r>
           <w:rPr>
             <w:rStyle w:val="Hyperlink"/>
@@ -3257,7 +3257,7 @@
           <w:numId w:val="1009"/>
         </w:numPr>
       </w:pPr>
-      <w:hyperlink r:id="rId43">
+      <w:hyperlink r:id="rId63">
         <w:r>
           <w:rPr>
             <w:rStyle w:val="Hyperlink"/>
@@ -3273,8 +3273,8 @@
         </w:pict>
       </w:r>
     </w:p>
-    <w:bookmarkEnd w:id="50"/>
-    <w:bookmarkStart w:id="52" w:name="X3dd4d75ec865e79b96479ee4aa4d8525fd8e21b"/>
+    <w:bookmarkEnd w:id="70"/>
+    <w:bookmarkStart w:id="72" w:name="X3dd4d75ec865e79b96479ee4aa4d8525fd8e21b"/>
     <w:p>
       <w:pPr>
         <w:pStyle w:val="Heading4"/>
@@ -3477,7 +3477,7 @@
           <w:numId w:val="1010"/>
         </w:numPr>
       </w:pPr>
-      <w:hyperlink r:id="rId51">
+      <w:hyperlink r:id="rId71">
         <w:r>
           <w:rPr>
             <w:rStyle w:val="Hyperlink"/>
@@ -3518,7 +3518,7 @@
           <w:numId w:val="1010"/>
         </w:numPr>
       </w:pPr>
-      <w:hyperlink r:id="rId43">
+      <w:hyperlink r:id="rId63">
         <w:r>
           <w:rPr>
             <w:rStyle w:val="Hyperlink"/>
@@ -3534,8 +3534,8 @@
         </w:pict>
       </w:r>
     </w:p>
-    <w:bookmarkEnd w:id="52"/>
-    <w:bookmarkStart w:id="54" w:name="X55182ffca8bf9a86f4f303ba4cdd1d54fb306f0"/>
+    <w:bookmarkEnd w:id="72"/>
+    <w:bookmarkStart w:id="74" w:name="X55182ffca8bf9a86f4f303ba4cdd1d54fb306f0"/>
     <w:p>
       <w:pPr>
         <w:pStyle w:val="Heading4"/>
@@ -3803,7 +3803,7 @@
           <w:numId w:val="1011"/>
         </w:numPr>
       </w:pPr>
-      <w:hyperlink r:id="rId53">
+      <w:hyperlink r:id="rId73">
         <w:r>
           <w:rPr>
             <w:rStyle w:val="Hyperlink"/>
@@ -3819,9 +3819,9 @@
         </w:pict>
       </w:r>
     </w:p>
-    <w:bookmarkEnd w:id="54"/>
-    <w:bookmarkEnd w:id="55"/>
-    <w:bookmarkStart w:id="67" w:name="database-configuration"/>
+    <w:bookmarkEnd w:id="74"/>
+    <w:bookmarkEnd w:id="75"/>
+    <w:bookmarkStart w:id="87" w:name="database-configuration"/>
     <w:p>
       <w:pPr>
         <w:pStyle w:val="Heading2"/>
@@ -3838,7 +3838,7 @@
         <w:t xml:space="preserve">This section covers MySQL/MariaDB configuration relevant to WordPress security.</w:t>
       </w:r>
     </w:p>
-    <w:bookmarkStart w:id="57" w:name="X53e835e02d359123c4bfd3a5542e5d5a754352a"/>
+    <w:bookmarkStart w:id="77" w:name="X53e835e02d359123c4bfd3a5542e5d5a754352a"/>
     <w:p>
       <w:pPr>
         <w:pStyle w:val="Heading4"/>
@@ -4464,7 +4464,7 @@
           <w:numId w:val="1012"/>
         </w:numPr>
       </w:pPr>
-      <w:hyperlink r:id="rId35">
+      <w:hyperlink r:id="rId55">
         <w:r>
           <w:rPr>
             <w:rStyle w:val="Hyperlink"/>
@@ -4481,7 +4481,7 @@
           <w:numId w:val="1012"/>
         </w:numPr>
       </w:pPr>
-      <w:hyperlink r:id="rId56">
+      <w:hyperlink r:id="rId76">
         <w:r>
           <w:rPr>
             <w:rStyle w:val="Hyperlink"/>
@@ -4497,8 +4497,8 @@
         </w:pict>
       </w:r>
     </w:p>
-    <w:bookmarkEnd w:id="57"/>
-    <w:bookmarkStart w:id="60" w:name="X14504102df393384c32e7daa09c939da4b9017b"/>
+    <w:bookmarkEnd w:id="77"/>
+    <w:bookmarkStart w:id="80" w:name="X14504102df393384c32e7daa09c939da4b9017b"/>
     <w:p>
       <w:pPr>
         <w:pStyle w:val="Heading4"/>
@@ -4728,7 +4728,7 @@
           <w:numId w:val="1013"/>
         </w:numPr>
       </w:pPr>
-      <w:hyperlink r:id="rId35">
+      <w:hyperlink r:id="rId55">
         <w:r>
           <w:rPr>
             <w:rStyle w:val="Hyperlink"/>
@@ -4745,7 +4745,7 @@
           <w:numId w:val="1013"/>
         </w:numPr>
       </w:pPr>
-      <w:hyperlink r:id="rId58">
+      <w:hyperlink r:id="rId78">
         <w:r>
           <w:rPr>
             <w:rStyle w:val="Hyperlink"/>
@@ -4762,7 +4762,7 @@
           <w:numId w:val="1013"/>
         </w:numPr>
       </w:pPr>
-      <w:hyperlink r:id="rId59">
+      <w:hyperlink r:id="rId79">
         <w:r>
           <w:rPr>
             <w:rStyle w:val="Hyperlink"/>
@@ -4802,8 +4802,8 @@
         </w:pict>
       </w:r>
     </w:p>
-    <w:bookmarkEnd w:id="60"/>
-    <w:bookmarkStart w:id="63" w:name="Xca9890352c1c45545b100976c4aa8479955a896"/>
+    <w:bookmarkEnd w:id="80"/>
+    <w:bookmarkStart w:id="83" w:name="Xca9890352c1c45545b100976c4aa8479955a896"/>
     <w:p>
       <w:pPr>
         <w:pStyle w:val="Heading4"/>
@@ -5044,7 +5044,7 @@
           <w:numId w:val="1014"/>
         </w:numPr>
       </w:pPr>
-      <w:hyperlink r:id="rId61">
+      <w:hyperlink r:id="rId81">
         <w:r>
           <w:rPr>
             <w:rStyle w:val="Hyperlink"/>
@@ -5097,7 +5097,7 @@
           <w:numId w:val="1014"/>
         </w:numPr>
       </w:pPr>
-      <w:hyperlink r:id="rId62">
+      <w:hyperlink r:id="rId82">
         <w:r>
           <w:rPr>
             <w:rStyle w:val="Hyperlink"/>
@@ -5113,8 +5113,8 @@
         </w:pict>
       </w:r>
     </w:p>
-    <w:bookmarkEnd w:id="63"/>
-    <w:bookmarkStart w:id="66" w:name="ensure-database-query-logging-is-enabled"/>
+    <w:bookmarkEnd w:id="83"/>
+    <w:bookmarkStart w:id="86" w:name="ensure-database-query-logging-is-enabled"/>
     <w:p>
       <w:pPr>
         <w:pStyle w:val="Heading4"/>
@@ -5369,7 +5369,7 @@
           <w:numId w:val="1015"/>
         </w:numPr>
       </w:pPr>
-      <w:hyperlink r:id="rId64">
+      <w:hyperlink r:id="rId84">
         <w:r>
           <w:rPr>
             <w:rStyle w:val="Hyperlink"/>
@@ -5386,7 +5386,7 @@
           <w:numId w:val="1015"/>
         </w:numPr>
       </w:pPr>
-      <w:hyperlink r:id="rId65">
+      <w:hyperlink r:id="rId85">
         <w:r>
           <w:rPr>
             <w:rStyle w:val="Hyperlink"/>
@@ -5402,9 +5402,9 @@
         </w:pict>
       </w:r>
     </w:p>
-    <w:bookmarkEnd w:id="66"/>
-    <w:bookmarkEnd w:id="67"/>
-    <w:bookmarkStart w:id="83" w:name="wordpress-core-configuration"/>
+    <w:bookmarkEnd w:id="86"/>
+    <w:bookmarkEnd w:id="87"/>
+    <w:bookmarkStart w:id="103" w:name="wordpress-core-configuration"/>
     <w:p>
       <w:pPr>
         <w:pStyle w:val="Heading2"/>
@@ -5436,7 +5436,7 @@
         <w:t xml:space="preserve">and WordPress core behavior.</w:t>
       </w:r>
     </w:p>
-    <w:bookmarkStart w:id="69" w:name="X28c2480fd3e79ceada8375b7381b81cbdfafe5c"/>
+    <w:bookmarkStart w:id="89" w:name="X28c2480fd3e79ceada8375b7381b81cbdfafe5c"/>
     <w:p>
       <w:pPr>
         <w:pStyle w:val="Heading4"/>
@@ -5927,7 +5927,7 @@
           <w:numId w:val="1016"/>
         </w:numPr>
       </w:pPr>
-      <w:hyperlink r:id="rId68">
+      <w:hyperlink r:id="rId88">
         <w:r>
           <w:rPr>
             <w:rStyle w:val="Hyperlink"/>
@@ -5944,7 +5944,7 @@
           <w:numId w:val="1016"/>
         </w:numPr>
       </w:pPr>
-      <w:hyperlink r:id="rId35">
+      <w:hyperlink r:id="rId55">
         <w:r>
           <w:rPr>
             <w:rStyle w:val="Hyperlink"/>
@@ -5960,8 +5960,8 @@
         </w:pict>
       </w:r>
     </w:p>
-    <w:bookmarkEnd w:id="69"/>
-    <w:bookmarkStart w:id="72" w:name="ensure-force_ssl_admin-is-set-to-true"/>
+    <w:bookmarkEnd w:id="89"/>
+    <w:bookmarkStart w:id="92" w:name="ensure-force_ssl_admin-is-set-to-true"/>
     <w:p>
       <w:pPr>
         <w:pStyle w:val="Heading4"/>
@@ -6257,7 +6257,7 @@
           <w:numId w:val="1017"/>
         </w:numPr>
       </w:pPr>
-      <w:hyperlink r:id="rId61">
+      <w:hyperlink r:id="rId81">
         <w:r>
           <w:rPr>
             <w:rStyle w:val="Hyperlink"/>
@@ -6310,7 +6310,7 @@
           <w:numId w:val="1017"/>
         </w:numPr>
       </w:pPr>
-      <w:hyperlink r:id="rId70">
+      <w:hyperlink r:id="rId90">
         <w:r>
           <w:rPr>
             <w:rStyle w:val="Hyperlink"/>
@@ -6327,7 +6327,7 @@
           <w:numId w:val="1017"/>
         </w:numPr>
       </w:pPr>
-      <w:hyperlink r:id="rId71">
+      <w:hyperlink r:id="rId91">
         <w:r>
           <w:rPr>
             <w:rStyle w:val="VerbatimChar"/>
@@ -6355,8 +6355,8 @@
         </w:pict>
       </w:r>
     </w:p>
-    <w:bookmarkEnd w:id="72"/>
-    <w:bookmarkStart w:id="74" w:name="X99d05a9db2105bb0177983691284d4ca98b08f1"/>
+    <w:bookmarkEnd w:id="92"/>
+    <w:bookmarkStart w:id="94" w:name="X99d05a9db2105bb0177983691284d4ca98b08f1"/>
     <w:p>
       <w:pPr>
         <w:pStyle w:val="Heading4"/>
@@ -6903,7 +6903,7 @@
           <w:numId w:val="1018"/>
         </w:numPr>
       </w:pPr>
-      <w:hyperlink r:id="rId61">
+      <w:hyperlink r:id="rId81">
         <w:r>
           <w:rPr>
             <w:rStyle w:val="Hyperlink"/>
@@ -6956,7 +6956,7 @@
           <w:numId w:val="1018"/>
         </w:numPr>
       </w:pPr>
-      <w:hyperlink r:id="rId73">
+      <w:hyperlink r:id="rId93">
         <w:r>
           <w:rPr>
             <w:rStyle w:val="VerbatimChar"/>
@@ -6985,7 +6985,7 @@
           <w:numId w:val="1018"/>
         </w:numPr>
       </w:pPr>
-      <w:hyperlink r:id="rId47">
+      <w:hyperlink r:id="rId67">
         <w:r>
           <w:rPr>
             <w:rStyle w:val="Hyperlink"/>
@@ -7025,8 +7025,8 @@
         </w:pict>
       </w:r>
     </w:p>
-    <w:bookmarkEnd w:id="74"/>
-    <w:bookmarkStart w:id="75" w:name="ensure-xml-rpc-is-disabled"/>
+    <w:bookmarkEnd w:id="94"/>
+    <w:bookmarkStart w:id="95" w:name="ensure-xml-rpc-is-disabled"/>
     <w:p>
       <w:pPr>
         <w:pStyle w:val="Heading4"/>
@@ -7416,7 +7416,7 @@
           <w:numId w:val="1019"/>
         </w:numPr>
       </w:pPr>
-      <w:hyperlink r:id="rId35">
+      <w:hyperlink r:id="rId55">
         <w:r>
           <w:rPr>
             <w:rStyle w:val="Hyperlink"/>
@@ -7432,8 +7432,8 @@
         </w:pict>
       </w:r>
     </w:p>
-    <w:bookmarkEnd w:id="75"/>
-    <w:bookmarkStart w:id="77" w:name="Xccfd45e4de583f7d6974826f121206ec193f546"/>
+    <w:bookmarkEnd w:id="95"/>
+    <w:bookmarkStart w:id="97" w:name="Xccfd45e4de583f7d6974826f121206ec193f546"/>
     <w:p>
       <w:pPr>
         <w:pStyle w:val="Heading4"/>
@@ -7822,7 +7822,7 @@
           <w:numId w:val="1020"/>
         </w:numPr>
       </w:pPr>
-      <w:hyperlink r:id="rId76">
+      <w:hyperlink r:id="rId96">
         <w:r>
           <w:rPr>
             <w:rStyle w:val="Hyperlink"/>
@@ -7838,8 +7838,8 @@
         </w:pict>
       </w:r>
     </w:p>
-    <w:bookmarkEnd w:id="77"/>
-    <w:bookmarkStart w:id="78" w:name="X2e7307636cb42ed0f1cbdc43b1abc4433af3b58"/>
+    <w:bookmarkEnd w:id="97"/>
+    <w:bookmarkStart w:id="98" w:name="X2e7307636cb42ed0f1cbdc43b1abc4433af3b58"/>
     <w:p>
       <w:pPr>
         <w:pStyle w:val="Heading4"/>
@@ -8161,7 +8161,7 @@
           <w:numId w:val="1021"/>
         </w:numPr>
       </w:pPr>
-      <w:hyperlink r:id="rId35">
+      <w:hyperlink r:id="rId55">
         <w:r>
           <w:rPr>
             <w:rStyle w:val="Hyperlink"/>
@@ -8177,8 +8177,8 @@
         </w:pict>
       </w:r>
     </w:p>
-    <w:bookmarkEnd w:id="78"/>
-    <w:bookmarkStart w:id="82" w:name="X476bc3ecbd02b5fbb1991ccf27b68ead97ab487"/>
+    <w:bookmarkEnd w:id="98"/>
+    <w:bookmarkStart w:id="102" w:name="X476bc3ecbd02b5fbb1991ccf27b68ead97ab487"/>
     <w:p>
       <w:pPr>
         <w:pStyle w:val="Heading4"/>
@@ -8679,7 +8679,7 @@
       <w:r>
         <w:t xml:space="preserve"> </w:t>
       </w:r>
-      <w:hyperlink r:id="rId79">
+      <w:hyperlink r:id="rId99">
         <w:r>
           <w:rPr>
             <w:rStyle w:val="Hyperlink"/>
@@ -8741,7 +8741,7 @@
           <w:numId w:val="1025"/>
         </w:numPr>
       </w:pPr>
-      <w:hyperlink r:id="rId80">
+      <w:hyperlink r:id="rId100">
         <w:r>
           <w:rPr>
             <w:rStyle w:val="Hyperlink"/>
@@ -8758,7 +8758,7 @@
           <w:numId w:val="1025"/>
         </w:numPr>
       </w:pPr>
-      <w:hyperlink r:id="rId81">
+      <w:hyperlink r:id="rId101">
         <w:r>
           <w:rPr>
             <w:rStyle w:val="Hyperlink"/>
@@ -8774,9 +8774,9 @@
         </w:pict>
       </w:r>
     </w:p>
-    <w:bookmarkEnd w:id="82"/>
-    <w:bookmarkEnd w:id="83"/>
-    <w:bookmarkStart w:id="115" w:name="authentication-and-access-control"/>
+    <w:bookmarkEnd w:id="102"/>
+    <w:bookmarkEnd w:id="103"/>
+    <w:bookmarkStart w:id="135" w:name="authentication-and-access-control"/>
     <w:p>
       <w:pPr>
         <w:pStyle w:val="Heading2"/>
@@ -8793,7 +8793,7 @@
         <w:t xml:space="preserve">This section addresses user authentication, session management, and role-based access control within WordPress.</w:t>
       </w:r>
     </w:p>
-    <w:bookmarkStart w:id="90" w:name="X58da6711d0250ef42104787d3298c5e1ce490ad"/>
+    <w:bookmarkStart w:id="110" w:name="X58da6711d0250ef42104787d3298c5e1ce490ad"/>
     <w:p>
       <w:pPr>
         <w:pStyle w:val="Heading4"/>
@@ -9015,7 +9015,7 @@
       <w:r>
         <w:t xml:space="preserve"> </w:t>
       </w:r>
-      <w:hyperlink r:id="rId79">
+      <w:hyperlink r:id="rId99">
         <w:r>
           <w:rPr>
             <w:rStyle w:val="Hyperlink"/>
@@ -9068,7 +9068,7 @@
           <w:numId w:val="1026"/>
         </w:numPr>
       </w:pPr>
-      <w:hyperlink r:id="rId84">
+      <w:hyperlink r:id="rId104">
         <w:r>
           <w:rPr>
             <w:rStyle w:val="Hyperlink"/>
@@ -9085,7 +9085,7 @@
           <w:numId w:val="1026"/>
         </w:numPr>
       </w:pPr>
-      <w:hyperlink r:id="rId85">
+      <w:hyperlink r:id="rId105">
         <w:r>
           <w:rPr>
             <w:rStyle w:val="Hyperlink"/>
@@ -9102,7 +9102,7 @@
       <w:r>
         <w:t xml:space="preserve"> </w:t>
       </w:r>
-      <w:hyperlink r:id="rId86">
+      <w:hyperlink r:id="rId106">
         <w:r>
           <w:rPr>
             <w:rStyle w:val="Hyperlink"/>
@@ -9119,7 +9119,7 @@
       <w:r>
         <w:t xml:space="preserve"> </w:t>
       </w:r>
-      <w:hyperlink r:id="rId87">
+      <w:hyperlink r:id="rId107">
         <w:r>
           <w:rPr>
             <w:rStyle w:val="Hyperlink"/>
@@ -9136,7 +9136,7 @@
       <w:r>
         <w:t xml:space="preserve"> </w:t>
       </w:r>
-      <w:hyperlink r:id="rId35">
+      <w:hyperlink r:id="rId55">
         <w:r>
           <w:rPr>
             <w:rStyle w:val="Hyperlink"/>
@@ -9153,7 +9153,7 @@
       <w:r>
         <w:t xml:space="preserve"> </w:t>
       </w:r>
-      <w:hyperlink r:id="rId88">
+      <w:hyperlink r:id="rId108">
         <w:r>
           <w:rPr>
             <w:rStyle w:val="Hyperlink"/>
@@ -9170,7 +9170,7 @@
           <w:numId w:val="1026"/>
         </w:numPr>
       </w:pPr>
-      <w:hyperlink r:id="rId89">
+      <w:hyperlink r:id="rId109">
         <w:r>
           <w:rPr>
             <w:rStyle w:val="Hyperlink"/>
@@ -9192,8 +9192,8 @@
         </w:pict>
       </w:r>
     </w:p>
-    <w:bookmarkEnd w:id="90"/>
-    <w:bookmarkStart w:id="94" w:name="X38b584e7db0f766b8ae894c7164200a2dfde080"/>
+    <w:bookmarkEnd w:id="110"/>
+    <w:bookmarkStart w:id="114" w:name="X38b584e7db0f766b8ae894c7164200a2dfde080"/>
     <w:p>
       <w:pPr>
         <w:pStyle w:val="Heading4"/>
@@ -9494,7 +9494,7 @@
           <w:numId w:val="1027"/>
         </w:numPr>
       </w:pPr>
-      <w:hyperlink r:id="rId91">
+      <w:hyperlink r:id="rId111">
         <w:r>
           <w:rPr>
             <w:rStyle w:val="Hyperlink"/>
@@ -9511,7 +9511,7 @@
           <w:numId w:val="1027"/>
         </w:numPr>
       </w:pPr>
-      <w:hyperlink r:id="rId92">
+      <w:hyperlink r:id="rId112">
         <w:r>
           <w:rPr>
             <w:rStyle w:val="Hyperlink"/>
@@ -9528,7 +9528,7 @@
           <w:numId w:val="1027"/>
         </w:numPr>
       </w:pPr>
-      <w:hyperlink r:id="rId93">
+      <w:hyperlink r:id="rId113">
         <w:r>
           <w:rPr>
             <w:rStyle w:val="Hyperlink"/>
@@ -9544,8 +9544,8 @@
         </w:pict>
       </w:r>
     </w:p>
-    <w:bookmarkEnd w:id="94"/>
-    <w:bookmarkStart w:id="98" w:name="Xc951442ee6a8b6b6c2a7057c9a2f603a7dd553d"/>
+    <w:bookmarkEnd w:id="114"/>
+    <w:bookmarkStart w:id="118" w:name="Xc951442ee6a8b6b6c2a7057c9a2f603a7dd553d"/>
     <w:p>
       <w:pPr>
         <w:pStyle w:val="Heading4"/>
@@ -10200,7 +10200,7 @@
           <w:numId w:val="1028"/>
         </w:numPr>
       </w:pPr>
-      <w:hyperlink r:id="rId95">
+      <w:hyperlink r:id="rId115">
         <w:r>
           <w:rPr>
             <w:rStyle w:val="VerbatimChar"/>
@@ -10229,7 +10229,7 @@
           <w:numId w:val="1028"/>
         </w:numPr>
       </w:pPr>
-      <w:hyperlink r:id="rId96">
+      <w:hyperlink r:id="rId116">
         <w:r>
           <w:rPr>
             <w:rStyle w:val="VerbatimChar"/>
@@ -10258,7 +10258,7 @@
           <w:numId w:val="1028"/>
         </w:numPr>
       </w:pPr>
-      <w:hyperlink r:id="rId97">
+      <w:hyperlink r:id="rId117">
         <w:r>
           <w:rPr>
             <w:rStyle w:val="Hyperlink"/>
@@ -10274,8 +10274,8 @@
         </w:pict>
       </w:r>
     </w:p>
-    <w:bookmarkEnd w:id="98"/>
-    <w:bookmarkStart w:id="100" w:name="ensure-user-enumeration-is-prevented"/>
+    <w:bookmarkEnd w:id="118"/>
+    <w:bookmarkStart w:id="120" w:name="ensure-user-enumeration-is-prevented"/>
     <w:p>
       <w:pPr>
         <w:pStyle w:val="Heading4"/>
@@ -10778,7 +10778,7 @@
           <w:numId w:val="1029"/>
         </w:numPr>
       </w:pPr>
-      <w:hyperlink r:id="rId93">
+      <w:hyperlink r:id="rId113">
         <w:r>
           <w:rPr>
             <w:rStyle w:val="Hyperlink"/>
@@ -10795,7 +10795,7 @@
           <w:numId w:val="1029"/>
         </w:numPr>
       </w:pPr>
-      <w:hyperlink r:id="rId39">
+      <w:hyperlink r:id="rId59">
         <w:r>
           <w:rPr>
             <w:rStyle w:val="Hyperlink"/>
@@ -10812,7 +10812,7 @@
           <w:numId w:val="1029"/>
         </w:numPr>
       </w:pPr>
-      <w:hyperlink r:id="rId99">
+      <w:hyperlink r:id="rId119">
         <w:r>
           <w:rPr>
             <w:rStyle w:val="Hyperlink"/>
@@ -10828,8 +10828,8 @@
         </w:pict>
       </w:r>
     </w:p>
-    <w:bookmarkEnd w:id="100"/>
-    <w:bookmarkStart w:id="106" w:name="X7cbc99c1b4618483d1612cb367b1bff753380b8"/>
+    <w:bookmarkEnd w:id="120"/>
+    <w:bookmarkStart w:id="126" w:name="X7cbc99c1b4618483d1612cb367b1bff753380b8"/>
     <w:p>
       <w:pPr>
         <w:pStyle w:val="Heading4"/>
@@ -10898,7 +10898,7 @@
       <w:r>
         <w:t xml:space="preserve"> </w:t>
       </w:r>
-      <w:hyperlink r:id="rId101">
+      <w:hyperlink r:id="rId121">
         <w:r>
           <w:rPr>
             <w:rStyle w:val="Hyperlink"/>
@@ -10915,7 +10915,7 @@
       <w:r>
         <w:t xml:space="preserve"> </w:t>
       </w:r>
-      <w:hyperlink r:id="rId102">
+      <w:hyperlink r:id="rId122">
         <w:r>
           <w:rPr>
             <w:rStyle w:val="Hyperlink"/>
@@ -10950,7 +10950,7 @@
       <w:r>
         <w:t xml:space="preserve"> </w:t>
       </w:r>
-      <w:hyperlink r:id="rId103">
+      <w:hyperlink r:id="rId123">
         <w:r>
           <w:rPr>
             <w:rStyle w:val="Hyperlink"/>
@@ -11198,7 +11198,7 @@
           <w:numId w:val="1030"/>
         </w:numPr>
       </w:pPr>
-      <w:hyperlink r:id="rId93">
+      <w:hyperlink r:id="rId113">
         <w:r>
           <w:rPr>
             <w:rStyle w:val="Hyperlink"/>
@@ -11215,7 +11215,7 @@
           <w:numId w:val="1030"/>
         </w:numPr>
       </w:pPr>
-      <w:hyperlink r:id="rId84">
+      <w:hyperlink r:id="rId104">
         <w:r>
           <w:rPr>
             <w:rStyle w:val="Hyperlink"/>
@@ -11232,7 +11232,7 @@
           <w:numId w:val="1030"/>
         </w:numPr>
       </w:pPr>
-      <w:hyperlink r:id="rId104">
+      <w:hyperlink r:id="rId124">
         <w:r>
           <w:rPr>
             <w:rStyle w:val="Hyperlink"/>
@@ -11255,7 +11255,7 @@
           <w:numId w:val="1030"/>
         </w:numPr>
       </w:pPr>
-      <w:hyperlink r:id="rId105">
+      <w:hyperlink r:id="rId125">
         <w:r>
           <w:rPr>
             <w:rStyle w:val="Hyperlink"/>
@@ -11277,8 +11277,8 @@
         </w:pict>
       </w:r>
     </w:p>
-    <w:bookmarkEnd w:id="106"/>
-    <w:bookmarkStart w:id="108" w:name="Xf55992fd52588c602d60b9c6a292e71e4d45dec"/>
+    <w:bookmarkEnd w:id="126"/>
+    <w:bookmarkStart w:id="128" w:name="Xf55992fd52588c602d60b9c6a292e71e4d45dec"/>
     <w:p>
       <w:pPr>
         <w:pStyle w:val="Heading4"/>
@@ -11794,7 +11794,7 @@
           <w:numId w:val="1032"/>
         </w:numPr>
       </w:pPr>
-      <w:hyperlink r:id="rId107">
+      <w:hyperlink r:id="rId127">
         <w:r>
           <w:rPr>
             <w:rStyle w:val="Hyperlink"/>
@@ -11811,7 +11811,7 @@
           <w:numId w:val="1032"/>
         </w:numPr>
       </w:pPr>
-      <w:hyperlink r:id="rId39">
+      <w:hyperlink r:id="rId59">
         <w:r>
           <w:rPr>
             <w:rStyle w:val="Hyperlink"/>
@@ -11828,7 +11828,7 @@
           <w:numId w:val="1032"/>
         </w:numPr>
       </w:pPr>
-      <w:hyperlink r:id="rId99">
+      <w:hyperlink r:id="rId119">
         <w:r>
           <w:rPr>
             <w:rStyle w:val="Hyperlink"/>
@@ -11844,8 +11844,8 @@
         </w:pict>
       </w:r>
     </w:p>
-    <w:bookmarkEnd w:id="108"/>
-    <w:bookmarkStart w:id="111" w:name="X59230c0b3b749d05c958983888eb2820f08906b"/>
+    <w:bookmarkEnd w:id="128"/>
+    <w:bookmarkStart w:id="131" w:name="X59230c0b3b749d05c958983888eb2820f08906b"/>
     <w:p>
       <w:pPr>
         <w:pStyle w:val="Heading4"/>
@@ -12107,7 +12107,7 @@
           <w:numId w:val="1033"/>
         </w:numPr>
       </w:pPr>
-      <w:hyperlink r:id="rId93">
+      <w:hyperlink r:id="rId113">
         <w:r>
           <w:rPr>
             <w:rStyle w:val="Hyperlink"/>
@@ -12124,7 +12124,7 @@
           <w:numId w:val="1033"/>
         </w:numPr>
       </w:pPr>
-      <w:hyperlink r:id="rId84">
+      <w:hyperlink r:id="rId104">
         <w:r>
           <w:rPr>
             <w:rStyle w:val="Hyperlink"/>
@@ -12135,7 +12135,7 @@
       <w:r>
         <w:t xml:space="preserve">, §</w:t>
       </w:r>
-      <w:hyperlink r:id="rId109">
+      <w:hyperlink r:id="rId129">
         <w:r>
           <w:rPr>
             <w:rStyle w:val="Hyperlink"/>
@@ -12149,7 +12149,7 @@
       <w:r>
         <w:t xml:space="preserve"> </w:t>
       </w:r>
-      <w:hyperlink r:id="rId110">
+      <w:hyperlink r:id="rId130">
         <w:r>
           <w:rPr>
             <w:rStyle w:val="Hyperlink"/>
@@ -12165,8 +12165,8 @@
         </w:pict>
       </w:r>
     </w:p>
-    <w:bookmarkEnd w:id="111"/>
-    <w:bookmarkStart w:id="114" w:name="Xf40f1da9cdc8cddd264d8a8397177040c8e8079"/>
+    <w:bookmarkEnd w:id="131"/>
+    <w:bookmarkStart w:id="134" w:name="Xf40f1da9cdc8cddd264d8a8397177040c8e8079"/>
     <w:p>
       <w:pPr>
         <w:pStyle w:val="Heading4"/>
@@ -12859,7 +12859,7 @@
           <w:numId w:val="1034"/>
         </w:numPr>
       </w:pPr>
-      <w:hyperlink r:id="rId91">
+      <w:hyperlink r:id="rId111">
         <w:r>
           <w:rPr>
             <w:rStyle w:val="Hyperlink"/>
@@ -12876,7 +12876,7 @@
           <w:numId w:val="1034"/>
         </w:numPr>
       </w:pPr>
-      <w:hyperlink r:id="rId112">
+      <w:hyperlink r:id="rId132">
         <w:r>
           <w:rPr>
             <w:rStyle w:val="VerbatimChar"/>
@@ -12905,7 +12905,7 @@
           <w:numId w:val="1034"/>
         </w:numPr>
       </w:pPr>
-      <w:hyperlink r:id="rId113">
+      <w:hyperlink r:id="rId133">
         <w:r>
           <w:rPr>
             <w:rStyle w:val="VerbatimChar"/>
@@ -12933,9 +12933,9 @@
         </w:pict>
       </w:r>
     </w:p>
-    <w:bookmarkEnd w:id="114"/>
-    <w:bookmarkEnd w:id="115"/>
-    <w:bookmarkStart w:id="120" w:name="file-system-permissions"/>
+    <w:bookmarkEnd w:id="134"/>
+    <w:bookmarkEnd w:id="135"/>
+    <w:bookmarkStart w:id="140" w:name="file-system-permissions"/>
     <w:p>
       <w:pPr>
         <w:pStyle w:val="Heading2"/>
@@ -12952,7 +12952,7 @@
         <w:t xml:space="preserve">This section covers file ownership and permission settings for the WordPress installation.</w:t>
       </w:r>
     </w:p>
-    <w:bookmarkStart w:id="117" w:name="X537a10d2bc9a031749d2d4395c48512c2fcd257"/>
+    <w:bookmarkStart w:id="137" w:name="X537a10d2bc9a031749d2d4395c48512c2fcd257"/>
     <w:p>
       <w:pPr>
         <w:pStyle w:val="Heading4"/>
@@ -13431,7 +13431,7 @@
           <w:numId w:val="1037"/>
         </w:numPr>
       </w:pPr>
-      <w:hyperlink r:id="rId35">
+      <w:hyperlink r:id="rId55">
         <w:r>
           <w:rPr>
             <w:rStyle w:val="Hyperlink"/>
@@ -13448,7 +13448,7 @@
           <w:numId w:val="1037"/>
         </w:numPr>
       </w:pPr>
-      <w:hyperlink r:id="rId116">
+      <w:hyperlink r:id="rId136">
         <w:r>
           <w:rPr>
             <w:rStyle w:val="Hyperlink"/>
@@ -13464,8 +13464,8 @@
         </w:pict>
       </w:r>
     </w:p>
-    <w:bookmarkEnd w:id="117"/>
-    <w:bookmarkStart w:id="118" w:name="X318749ae37d296d768503117ef65589e273c80d"/>
+    <w:bookmarkEnd w:id="137"/>
+    <w:bookmarkStart w:id="138" w:name="X318749ae37d296d768503117ef65589e273c80d"/>
     <w:p>
       <w:pPr>
         <w:pStyle w:val="Heading4"/>
@@ -13797,7 +13797,7 @@
           <w:numId w:val="1039"/>
         </w:numPr>
       </w:pPr>
-      <w:hyperlink r:id="rId116">
+      <w:hyperlink r:id="rId136">
         <w:r>
           <w:rPr>
             <w:rStyle w:val="Hyperlink"/>
@@ -13814,7 +13814,7 @@
           <w:numId w:val="1039"/>
         </w:numPr>
       </w:pPr>
-      <w:hyperlink r:id="rId35">
+      <w:hyperlink r:id="rId55">
         <w:r>
           <w:rPr>
             <w:rStyle w:val="Hyperlink"/>
@@ -13830,8 +13830,8 @@
         </w:pict>
       </w:r>
     </w:p>
-    <w:bookmarkEnd w:id="118"/>
-    <w:bookmarkStart w:id="119" w:name="X08717294e8e9ba263a432c09d1baf3cd44e02d6"/>
+    <w:bookmarkEnd w:id="138"/>
+    <w:bookmarkStart w:id="139" w:name="X08717294e8e9ba263a432c09d1baf3cd44e02d6"/>
     <w:p>
       <w:pPr>
         <w:pStyle w:val="Heading4"/>
@@ -14179,7 +14179,7 @@
           <w:numId w:val="1040"/>
         </w:numPr>
       </w:pPr>
-      <w:hyperlink r:id="rId61">
+      <w:hyperlink r:id="rId81">
         <w:r>
           <w:rPr>
             <w:rStyle w:val="Hyperlink"/>
@@ -14220,7 +14220,7 @@
           <w:numId w:val="1040"/>
         </w:numPr>
       </w:pPr>
-      <w:hyperlink r:id="rId35">
+      <w:hyperlink r:id="rId55">
         <w:r>
           <w:rPr>
             <w:rStyle w:val="Hyperlink"/>
@@ -14236,9 +14236,9 @@
         </w:pict>
       </w:r>
     </w:p>
-    <w:bookmarkEnd w:id="119"/>
-    <w:bookmarkEnd w:id="120"/>
-    <w:bookmarkStart w:id="130" w:name="logging-and-monitoring"/>
+    <w:bookmarkEnd w:id="139"/>
+    <w:bookmarkEnd w:id="140"/>
+    <w:bookmarkStart w:id="150" w:name="logging-and-monitoring"/>
     <w:p>
       <w:pPr>
         <w:pStyle w:val="Heading2"/>
@@ -14255,7 +14255,7 @@
         <w:t xml:space="preserve">This section addresses audit logging, activity monitoring, and intrusion detection for WordPress.</w:t>
       </w:r>
     </w:p>
-    <w:bookmarkStart w:id="123" w:name="Xac1ef11c0b7180ad5f777a47b6fc693c2f6dccc"/>
+    <w:bookmarkStart w:id="143" w:name="Xac1ef11c0b7180ad5f777a47b6fc693c2f6dccc"/>
     <w:p>
       <w:pPr>
         <w:pStyle w:val="Heading4"/>
@@ -14472,7 +14472,7 @@
           <w:numId w:val="1041"/>
         </w:numPr>
       </w:pPr>
-      <w:hyperlink r:id="rId121">
+      <w:hyperlink r:id="rId141">
         <w:r>
           <w:rPr>
             <w:rStyle w:val="Hyperlink"/>
@@ -14489,7 +14489,7 @@
           <w:numId w:val="1041"/>
         </w:numPr>
       </w:pPr>
-      <w:hyperlink r:id="rId122">
+      <w:hyperlink r:id="rId142">
         <w:r>
           <w:rPr>
             <w:rStyle w:val="VerbatimChar"/>
@@ -14517,8 +14517,8 @@
         </w:pict>
       </w:r>
     </w:p>
-    <w:bookmarkEnd w:id="123"/>
-    <w:bookmarkStart w:id="126" w:name="X1254b9a129313ac5901dd326a4d3d150cca0fe4"/>
+    <w:bookmarkEnd w:id="143"/>
+    <w:bookmarkStart w:id="146" w:name="X1254b9a129313ac5901dd326a4d3d150cca0fe4"/>
     <w:p>
       <w:pPr>
         <w:pStyle w:val="Heading4"/>
@@ -14775,7 +14775,7 @@
       <w:r>
         <w:t xml:space="preserve"> </w:t>
       </w:r>
-      <w:hyperlink r:id="rId79">
+      <w:hyperlink r:id="rId99">
         <w:r>
           <w:rPr>
             <w:rStyle w:val="Hyperlink"/>
@@ -14828,7 +14828,7 @@
           <w:numId w:val="1042"/>
         </w:numPr>
       </w:pPr>
-      <w:hyperlink r:id="rId124">
+      <w:hyperlink r:id="rId144">
         <w:r>
           <w:rPr>
             <w:rStyle w:val="Hyperlink"/>
@@ -14857,7 +14857,7 @@
           <w:numId w:val="1042"/>
         </w:numPr>
       </w:pPr>
-      <w:hyperlink r:id="rId125">
+      <w:hyperlink r:id="rId145">
         <w:r>
           <w:rPr>
             <w:rStyle w:val="Hyperlink"/>
@@ -14885,8 +14885,8 @@
         </w:pict>
       </w:r>
     </w:p>
-    <w:bookmarkEnd w:id="126"/>
-    <w:bookmarkStart w:id="129" w:name="X2f49715b02624f6337bc98ddb891dfd9472097b"/>
+    <w:bookmarkEnd w:id="146"/>
+    <w:bookmarkStart w:id="149" w:name="X2f49715b02624f6337bc98ddb891dfd9472097b"/>
     <w:p>
       <w:pPr>
         <w:pStyle w:val="Heading4"/>
@@ -15184,7 +15184,7 @@
           <w:numId w:val="1045"/>
         </w:numPr>
       </w:pPr>
-      <w:hyperlink r:id="rId127">
+      <w:hyperlink r:id="rId147">
         <w:r>
           <w:rPr>
             <w:rStyle w:val="Hyperlink"/>
@@ -15201,7 +15201,7 @@
           <w:numId w:val="1045"/>
         </w:numPr>
       </w:pPr>
-      <w:hyperlink r:id="rId35">
+      <w:hyperlink r:id="rId55">
         <w:r>
           <w:rPr>
             <w:rStyle w:val="Hyperlink"/>
@@ -15218,7 +15218,7 @@
           <w:numId w:val="1045"/>
         </w:numPr>
       </w:pPr>
-      <w:hyperlink r:id="rId128">
+      <w:hyperlink r:id="rId148">
         <w:r>
           <w:rPr>
             <w:rStyle w:val="Hyperlink"/>
@@ -15234,9 +15234,9 @@
         </w:pict>
       </w:r>
     </w:p>
-    <w:bookmarkEnd w:id="129"/>
-    <w:bookmarkEnd w:id="130"/>
-    <w:bookmarkStart w:id="142" w:name="X7e9f1bde50c8aa30356290a7617a8b456c65843"/>
+    <w:bookmarkEnd w:id="149"/>
+    <w:bookmarkEnd w:id="150"/>
+    <w:bookmarkStart w:id="162" w:name="X7e9f1bde50c8aa30356290a7617a8b456c65843"/>
     <w:p>
       <w:pPr>
         <w:pStyle w:val="Heading2"/>
@@ -15253,7 +15253,7 @@
         <w:t xml:space="preserve">This section addresses the security of pluggable WordPress components known as plugins and themes (as well as their sub-components called extensions or add-ons), and their update processes.</w:t>
       </w:r>
     </w:p>
-    <w:bookmarkStart w:id="133" w:name="Xf18672d95cbe870fcfb1313e755889980849210"/>
+    <w:bookmarkStart w:id="153" w:name="Xf18672d95cbe870fcfb1313e755889980849210"/>
     <w:p>
       <w:pPr>
         <w:pStyle w:val="Heading4"/>
@@ -15538,7 +15538,7 @@
           <w:numId w:val="1046"/>
         </w:numPr>
       </w:pPr>
-      <w:hyperlink r:id="rId35">
+      <w:hyperlink r:id="rId55">
         <w:r>
           <w:rPr>
             <w:rStyle w:val="Hyperlink"/>
@@ -15555,7 +15555,7 @@
           <w:numId w:val="1046"/>
         </w:numPr>
       </w:pPr>
-      <w:hyperlink r:id="rId131">
+      <w:hyperlink r:id="rId151">
         <w:r>
           <w:rPr>
             <w:rStyle w:val="Hyperlink"/>
@@ -15572,7 +15572,7 @@
           <w:numId w:val="1046"/>
         </w:numPr>
       </w:pPr>
-      <w:hyperlink r:id="rId132">
+      <w:hyperlink r:id="rId152">
         <w:r>
           <w:rPr>
             <w:rStyle w:val="Hyperlink"/>
@@ -15588,8 +15588,8 @@
         </w:pict>
       </w:r>
     </w:p>
-    <w:bookmarkEnd w:id="133"/>
-    <w:bookmarkStart w:id="135" w:name="X5d2c468734a3d7c0301ee405fdbdc04db22ca47"/>
+    <w:bookmarkEnd w:id="153"/>
+    <w:bookmarkStart w:id="155" w:name="X5d2c468734a3d7c0301ee405fdbdc04db22ca47"/>
     <w:p>
       <w:pPr>
         <w:pStyle w:val="Heading4"/>
@@ -15834,7 +15834,7 @@
           <w:numId w:val="1047"/>
         </w:numPr>
       </w:pPr>
-      <w:hyperlink r:id="rId134">
+      <w:hyperlink r:id="rId154">
         <w:r>
           <w:rPr>
             <w:rStyle w:val="Hyperlink"/>
@@ -15851,7 +15851,7 @@
           <w:numId w:val="1047"/>
         </w:numPr>
       </w:pPr>
-      <w:hyperlink r:id="rId35">
+      <w:hyperlink r:id="rId55">
         <w:r>
           <w:rPr>
             <w:rStyle w:val="Hyperlink"/>
@@ -15867,8 +15867,8 @@
         </w:pict>
       </w:r>
     </w:p>
-    <w:bookmarkEnd w:id="135"/>
-    <w:bookmarkStart w:id="138" w:name="Xc236da181558471dcad82deb3aecc5e6da634b3"/>
+    <w:bookmarkEnd w:id="155"/>
+    <w:bookmarkStart w:id="158" w:name="Xc236da181558471dcad82deb3aecc5e6da634b3"/>
     <w:p>
       <w:pPr>
         <w:pStyle w:val="Heading4"/>
@@ -16061,7 +16061,7 @@
       <w:r>
         <w:t xml:space="preserve"> </w:t>
       </w:r>
-      <w:hyperlink r:id="rId79">
+      <w:hyperlink r:id="rId99">
         <w:r>
           <w:rPr>
             <w:rStyle w:val="Hyperlink"/>
@@ -16114,7 +16114,7 @@
           <w:numId w:val="1048"/>
         </w:numPr>
       </w:pPr>
-      <w:hyperlink r:id="rId136">
+      <w:hyperlink r:id="rId156">
         <w:r>
           <w:rPr>
             <w:rStyle w:val="Hyperlink"/>
@@ -16131,7 +16131,7 @@
           <w:numId w:val="1048"/>
         </w:numPr>
       </w:pPr>
-      <w:hyperlink r:id="rId137">
+      <w:hyperlink r:id="rId157">
         <w:r>
           <w:rPr>
             <w:rStyle w:val="Hyperlink"/>
@@ -16147,8 +16147,8 @@
         </w:pict>
       </w:r>
     </w:p>
-    <w:bookmarkEnd w:id="138"/>
-    <w:bookmarkStart w:id="141" w:name="Xb492f7c7e5cf9fa0e870cc11b9b83ea852b9873"/>
+    <w:bookmarkEnd w:id="158"/>
+    <w:bookmarkStart w:id="161" w:name="Xb492f7c7e5cf9fa0e870cc11b9b83ea852b9873"/>
     <w:p>
       <w:pPr>
         <w:pStyle w:val="Heading4"/>
@@ -16488,7 +16488,7 @@
           <w:numId w:val="1051"/>
         </w:numPr>
       </w:pPr>
-      <w:hyperlink r:id="rId139">
+      <w:hyperlink r:id="rId159">
         <w:r>
           <w:rPr>
             <w:rStyle w:val="Hyperlink"/>
@@ -16505,7 +16505,7 @@
           <w:numId w:val="1051"/>
         </w:numPr>
       </w:pPr>
-      <w:hyperlink r:id="rId140">
+      <w:hyperlink r:id="rId160">
         <w:r>
           <w:rPr>
             <w:rStyle w:val="Hyperlink"/>
@@ -16521,9 +16521,9 @@
         </w:pict>
       </w:r>
     </w:p>
-    <w:bookmarkEnd w:id="141"/>
-    <w:bookmarkEnd w:id="142"/>
-    <w:bookmarkStart w:id="146" w:name="web-application-firewall"/>
+    <w:bookmarkEnd w:id="161"/>
+    <w:bookmarkEnd w:id="162"/>
+    <w:bookmarkStart w:id="166" w:name="web-application-firewall"/>
     <w:p>
       <w:pPr>
         <w:pStyle w:val="Heading2"/>
@@ -16540,7 +16540,7 @@
         <w:t xml:space="preserve">This section addresses the deployment and configuration of a Web Application Firewall (WAF) to protect the WordPress application.</w:t>
       </w:r>
     </w:p>
-    <w:bookmarkStart w:id="145" w:name="X2bcda6a58cd1d875b7e3c078bcb415c0e274696"/>
+    <w:bookmarkStart w:id="165" w:name="X2bcda6a58cd1d875b7e3c078bcb415c0e274696"/>
     <w:p>
       <w:pPr>
         <w:pStyle w:val="Heading4"/>
@@ -16846,7 +16846,7 @@
       <w:r>
         <w:t xml:space="preserve"> </w:t>
       </w:r>
-      <w:hyperlink r:id="rId143">
+      <w:hyperlink r:id="rId163">
         <w:r>
           <w:rPr>
             <w:rStyle w:val="Hyperlink"/>
@@ -16916,7 +16916,7 @@
       <w:r>
         <w:t xml:space="preserve"> </w:t>
       </w:r>
-      <w:hyperlink r:id="rId103">
+      <w:hyperlink r:id="rId123">
         <w:r>
           <w:rPr>
             <w:rStyle w:val="Hyperlink"/>
@@ -16951,7 +16951,7 @@
           <w:numId w:val="1052"/>
         </w:numPr>
       </w:pPr>
-      <w:hyperlink r:id="rId144">
+      <w:hyperlink r:id="rId164">
         <w:r>
           <w:rPr>
             <w:rStyle w:val="Hyperlink"/>
@@ -16968,7 +16968,7 @@
           <w:numId w:val="1052"/>
         </w:numPr>
       </w:pPr>
-      <w:hyperlink r:id="rId143">
+      <w:hyperlink r:id="rId163">
         <w:r>
           <w:rPr>
             <w:rStyle w:val="Hyperlink"/>
@@ -16984,9 +16984,9 @@
         </w:pict>
       </w:r>
     </w:p>
-    <w:bookmarkEnd w:id="145"/>
-    <w:bookmarkEnd w:id="146"/>
-    <w:bookmarkStart w:id="151" w:name="backup-and-recovery"/>
+    <w:bookmarkEnd w:id="165"/>
+    <w:bookmarkEnd w:id="166"/>
+    <w:bookmarkStart w:id="171" w:name="backup-and-recovery"/>
     <w:p>
       <w:pPr>
         <w:pStyle w:val="Heading2"/>
@@ -17003,7 +17003,7 @@
         <w:t xml:space="preserve">This section addresses backup strategy, offsite storage, and recovery procedures for WordPress deployments.</w:t>
       </w:r>
     </w:p>
-    <w:bookmarkStart w:id="150" w:name="X37031fc2d925a09a3cac64b9b44c9feb1a5b345"/>
+    <w:bookmarkStart w:id="170" w:name="X37031fc2d925a09a3cac64b9b44c9feb1a5b345"/>
     <w:p>
       <w:pPr>
         <w:pStyle w:val="Heading4"/>
@@ -17308,7 +17308,7 @@
           <w:numId w:val="1054"/>
         </w:numPr>
       </w:pPr>
-      <w:hyperlink r:id="rId147">
+      <w:hyperlink r:id="rId167">
         <w:r>
           <w:rPr>
             <w:rStyle w:val="Hyperlink"/>
@@ -17325,7 +17325,7 @@
           <w:numId w:val="1054"/>
         </w:numPr>
       </w:pPr>
-      <w:hyperlink r:id="rId148">
+      <w:hyperlink r:id="rId168">
         <w:r>
           <w:rPr>
             <w:rStyle w:val="Hyperlink"/>
@@ -17342,7 +17342,7 @@
           <w:numId w:val="1054"/>
         </w:numPr>
       </w:pPr>
-      <w:hyperlink r:id="rId149">
+      <w:hyperlink r:id="rId169">
         <w:r>
           <w:rPr>
             <w:rStyle w:val="Hyperlink"/>
@@ -17358,9 +17358,9 @@
         </w:pict>
       </w:r>
     </w:p>
-    <w:bookmarkEnd w:id="150"/>
-    <w:bookmarkEnd w:id="151"/>
-    <w:bookmarkStart w:id="167" w:name="ai-integration-security"/>
+    <w:bookmarkEnd w:id="170"/>
+    <w:bookmarkEnd w:id="171"/>
+    <w:bookmarkStart w:id="187" w:name="ai-integration-security"/>
     <w:p>
       <w:pPr>
         <w:pStyle w:val="Heading2"/>
@@ -17377,7 +17377,7 @@
         <w:t xml:space="preserve">AI tools are increasingly integrated into WordPress workflows for content generation, chatbots, code assistance, and site management. IBM’s Cost of a Data Breach Report (2025) found that 13% of organizations experienced a breach involving an AI model or application, and 97% of those breaches involved systems lacking proper access controls. This section provides controls for securing AI integrations in WordPress environments.</w:t>
       </w:r>
     </w:p>
-    <w:bookmarkStart w:id="159" w:name="ensure-ai-api-keys-are-securely-stored"/>
+    <w:bookmarkStart w:id="179" w:name="ensure-ai-api-keys-are-securely-stored"/>
     <w:p>
       <w:pPr>
         <w:pStyle w:val="Heading4"/>
@@ -17805,7 +17805,7 @@
           <w:numId w:val="1058"/>
         </w:numPr>
       </w:pPr>
-      <w:hyperlink r:id="rId152">
+      <w:hyperlink r:id="rId172">
         <w:r>
           <w:rPr>
             <w:rStyle w:val="Hyperlink"/>
@@ -17822,7 +17822,7 @@
           <w:numId w:val="1058"/>
         </w:numPr>
       </w:pPr>
-      <w:hyperlink r:id="rId153">
+      <w:hyperlink r:id="rId173">
         <w:r>
           <w:rPr>
             <w:rStyle w:val="Hyperlink"/>
@@ -17845,7 +17845,7 @@
       <w:r>
         <w:t xml:space="preserve"> </w:t>
       </w:r>
-      <w:hyperlink r:id="rId154">
+      <w:hyperlink r:id="rId174">
         <w:r>
           <w:rPr>
             <w:rStyle w:val="Hyperlink"/>
@@ -17868,7 +17868,7 @@
       <w:r>
         <w:t xml:space="preserve"> </w:t>
       </w:r>
-      <w:hyperlink r:id="rId155">
+      <w:hyperlink r:id="rId175">
         <w:r>
           <w:rPr>
             <w:rStyle w:val="Hyperlink"/>
@@ -17891,7 +17891,7 @@
       <w:r>
         <w:t xml:space="preserve"> </w:t>
       </w:r>
-      <w:hyperlink r:id="rId156">
+      <w:hyperlink r:id="rId176">
         <w:r>
           <w:rPr>
             <w:rStyle w:val="Hyperlink"/>
@@ -17908,7 +17908,7 @@
           <w:numId w:val="1058"/>
         </w:numPr>
       </w:pPr>
-      <w:hyperlink r:id="rId157">
+      <w:hyperlink r:id="rId177">
         <w:r>
           <w:rPr>
             <w:rStyle w:val="Hyperlink"/>
@@ -17925,7 +17925,7 @@
           <w:numId w:val="1058"/>
         </w:numPr>
       </w:pPr>
-      <w:hyperlink r:id="rId158">
+      <w:hyperlink r:id="rId178">
         <w:r>
           <w:rPr>
             <w:rStyle w:val="Hyperlink"/>
@@ -17953,8 +17953,8 @@
         </w:pict>
       </w:r>
     </w:p>
-    <w:bookmarkEnd w:id="159"/>
-    <w:bookmarkStart w:id="163" w:name="ensure-ai-generated-content-is-sanitized"/>
+    <w:bookmarkEnd w:id="179"/>
+    <w:bookmarkStart w:id="183" w:name="ensure-ai-generated-content-is-sanitized"/>
     <w:p>
       <w:pPr>
         <w:pStyle w:val="Heading4"/>
@@ -18280,7 +18280,7 @@
           <w:numId w:val="1060"/>
         </w:numPr>
       </w:pPr>
-      <w:hyperlink r:id="rId160">
+      <w:hyperlink r:id="rId180">
         <w:r>
           <w:rPr>
             <w:rStyle w:val="Hyperlink"/>
@@ -18297,7 +18297,7 @@
           <w:numId w:val="1060"/>
         </w:numPr>
       </w:pPr>
-      <w:hyperlink r:id="rId161">
+      <w:hyperlink r:id="rId181">
         <w:r>
           <w:rPr>
             <w:rStyle w:val="Hyperlink"/>
@@ -18314,7 +18314,7 @@
           <w:numId w:val="1060"/>
         </w:numPr>
       </w:pPr>
-      <w:hyperlink r:id="rId162">
+      <w:hyperlink r:id="rId182">
         <w:r>
           <w:rPr>
             <w:rStyle w:val="VerbatimChar"/>
@@ -18342,8 +18342,8 @@
         </w:pict>
       </w:r>
     </w:p>
-    <w:bookmarkEnd w:id="163"/>
-    <w:bookmarkStart w:id="166" w:name="X6585c3c8a5d3affa82317ab1fc774c5069542c5"/>
+    <w:bookmarkEnd w:id="183"/>
+    <w:bookmarkStart w:id="186" w:name="X6585c3c8a5d3affa82317ab1fc774c5069542c5"/>
     <w:p>
       <w:pPr>
         <w:pStyle w:val="Heading4"/>
@@ -18592,7 +18592,7 @@
           <w:numId w:val="1063"/>
         </w:numPr>
       </w:pPr>
-      <w:hyperlink r:id="rId164">
+      <w:hyperlink r:id="rId184">
         <w:r>
           <w:rPr>
             <w:rStyle w:val="Hyperlink"/>
@@ -18609,7 +18609,7 @@
           <w:numId w:val="1063"/>
         </w:numPr>
       </w:pPr>
-      <w:hyperlink r:id="rId165">
+      <w:hyperlink r:id="rId185">
         <w:r>
           <w:rPr>
             <w:rStyle w:val="Hyperlink"/>
@@ -18625,9 +18625,9 @@
         </w:pict>
       </w:r>
     </w:p>
-    <w:bookmarkEnd w:id="166"/>
-    <w:bookmarkEnd w:id="167"/>
-    <w:bookmarkStart w:id="175" w:name="server-access-and-network"/>
+    <w:bookmarkEnd w:id="186"/>
+    <w:bookmarkEnd w:id="187"/>
+    <w:bookmarkStart w:id="195" w:name="server-access-and-network"/>
     <w:p>
       <w:pPr>
         <w:pStyle w:val="Heading2"/>
@@ -18644,7 +18644,7 @@
         <w:t xml:space="preserve">This section addresses secure remote access to the server hosting WordPress and host-level network controls.</w:t>
       </w:r>
     </w:p>
-    <w:bookmarkStart w:id="169" w:name="Xdcbe01b24edad71f2460d1c6284218e85ca0653"/>
+    <w:bookmarkStart w:id="189" w:name="Xdcbe01b24edad71f2460d1c6284218e85ca0653"/>
     <w:p>
       <w:pPr>
         <w:pStyle w:val="Heading4"/>
@@ -18923,7 +18923,7 @@
           <w:numId w:val="1064"/>
         </w:numPr>
       </w:pPr>
-      <w:hyperlink r:id="rId168">
+      <w:hyperlink r:id="rId188">
         <w:r>
           <w:rPr>
             <w:rStyle w:val="Hyperlink"/>
@@ -18963,8 +18963,8 @@
         </w:pict>
       </w:r>
     </w:p>
-    <w:bookmarkEnd w:id="169"/>
-    <w:bookmarkStart w:id="170" w:name="ensure-sftp-is-used-and-ftp-is-disabled"/>
+    <w:bookmarkEnd w:id="189"/>
+    <w:bookmarkStart w:id="190" w:name="ensure-sftp-is-used-and-ftp-is-disabled"/>
     <w:p>
       <w:pPr>
         <w:pStyle w:val="Heading4"/>
@@ -19225,7 +19225,7 @@
           <w:numId w:val="1068"/>
         </w:numPr>
       </w:pPr>
-      <w:hyperlink r:id="rId168">
+      <w:hyperlink r:id="rId188">
         <w:r>
           <w:rPr>
             <w:rStyle w:val="Hyperlink"/>
@@ -19265,8 +19265,8 @@
         </w:pict>
       </w:r>
     </w:p>
-    <w:bookmarkEnd w:id="170"/>
-    <w:bookmarkStart w:id="172" w:name="X8bcf34366d44f5ac01a0d2c0e8134cbce888acf"/>
+    <w:bookmarkEnd w:id="190"/>
+    <w:bookmarkStart w:id="192" w:name="X8bcf34366d44f5ac01a0d2c0e8134cbce888acf"/>
     <w:p>
       <w:pPr>
         <w:pStyle w:val="Heading4"/>
@@ -19555,7 +19555,7 @@
           <w:numId w:val="1069"/>
         </w:numPr>
       </w:pPr>
-      <w:hyperlink r:id="rId171">
+      <w:hyperlink r:id="rId191">
         <w:r>
           <w:rPr>
             <w:rStyle w:val="Hyperlink"/>
@@ -19571,8 +19571,8 @@
         </w:pict>
       </w:r>
     </w:p>
-    <w:bookmarkEnd w:id="172"/>
-    <w:bookmarkStart w:id="174" w:name="X9d32ec75da2d03739426d99d14ff0b7003c0656"/>
+    <w:bookmarkEnd w:id="192"/>
+    <w:bookmarkStart w:id="194" w:name="X9d32ec75da2d03739426d99d14ff0b7003c0656"/>
     <w:p>
       <w:pPr>
         <w:pStyle w:val="Heading4"/>
@@ -19965,7 +19965,7 @@
           <w:numId w:val="1073"/>
         </w:numPr>
       </w:pPr>
-      <w:hyperlink r:id="rId173">
+      <w:hyperlink r:id="rId193">
         <w:r>
           <w:rPr>
             <w:rStyle w:val="Hyperlink"/>
@@ -19981,9 +19981,9 @@
         </w:pict>
       </w:r>
     </w:p>
-    <w:bookmarkEnd w:id="174"/>
-    <w:bookmarkEnd w:id="175"/>
-    <w:bookmarkStart w:id="180" w:name="multisite-security"/>
+    <w:bookmarkEnd w:id="194"/>
+    <w:bookmarkEnd w:id="195"/>
+    <w:bookmarkStart w:id="200" w:name="multisite-security"/>
     <w:p>
       <w:pPr>
         <w:pStyle w:val="Heading2"/>
@@ -20000,7 +20000,7 @@
         <w:t xml:space="preserve">This section addresses security considerations specific to WordPress Multisite installations.</w:t>
       </w:r>
     </w:p>
-    <w:bookmarkStart w:id="178" w:name="Xb5de61672eb24313b8c6dca365fd92ee3f077e6"/>
+    <w:bookmarkStart w:id="198" w:name="Xb5de61672eb24313b8c6dca365fd92ee3f077e6"/>
     <w:p>
       <w:pPr>
         <w:pStyle w:val="Heading4"/>
@@ -20243,7 +20243,7 @@
           <w:numId w:val="1076"/>
         </w:numPr>
       </w:pPr>
-      <w:hyperlink r:id="rId92">
+      <w:hyperlink r:id="rId112">
         <w:r>
           <w:rPr>
             <w:rStyle w:val="Hyperlink"/>
@@ -20260,7 +20260,7 @@
           <w:numId w:val="1076"/>
         </w:numPr>
       </w:pPr>
-      <w:hyperlink r:id="rId176">
+      <w:hyperlink r:id="rId196">
         <w:r>
           <w:rPr>
             <w:rStyle w:val="Hyperlink"/>
@@ -20277,7 +20277,7 @@
           <w:numId w:val="1076"/>
         </w:numPr>
       </w:pPr>
-      <w:hyperlink r:id="rId177">
+      <w:hyperlink r:id="rId197">
         <w:r>
           <w:rPr>
             <w:rStyle w:val="Hyperlink"/>
@@ -20317,8 +20317,8 @@
         </w:pict>
       </w:r>
     </w:p>
-    <w:bookmarkEnd w:id="178"/>
-    <w:bookmarkStart w:id="179" w:name="Xefeecf4be204cbf74dd485079e44e275974c82c"/>
+    <w:bookmarkEnd w:id="198"/>
+    <w:bookmarkStart w:id="199" w:name="Xefeecf4be204cbf74dd485079e44e275974c82c"/>
     <w:p>
       <w:pPr>
         <w:pStyle w:val="Heading4"/>
@@ -20558,7 +20558,7 @@
           <w:numId w:val="1078"/>
         </w:numPr>
       </w:pPr>
-      <w:hyperlink r:id="rId92">
+      <w:hyperlink r:id="rId112">
         <w:r>
           <w:rPr>
             <w:rStyle w:val="Hyperlink"/>
@@ -20575,7 +20575,7 @@
           <w:numId w:val="1078"/>
         </w:numPr>
       </w:pPr>
-      <w:hyperlink r:id="rId176">
+      <w:hyperlink r:id="rId196">
         <w:r>
           <w:rPr>
             <w:rStyle w:val="Hyperlink"/>
@@ -20591,9 +20591,9 @@
         </w:pict>
       </w:r>
     </w:p>
-    <w:bookmarkEnd w:id="179"/>
-    <w:bookmarkEnd w:id="180"/>
-    <w:bookmarkStart w:id="181" w:name="appendix-a-recommendation-summary"/>
+    <w:bookmarkEnd w:id="199"/>
+    <w:bookmarkEnd w:id="200"/>
+    <w:bookmarkStart w:id="201" w:name="appendix-a-recommendation-summary"/>
     <w:p>
       <w:pPr>
         <w:pStyle w:val="Heading2"/>
@@ -23223,8 +23223,8 @@
         </w:tc>
       </w:tr>
     </w:tbl>
-    <w:bookmarkEnd w:id="181"/>
-    <w:bookmarkStart w:id="182" w:name="X24eb9b3eb0d379335dea7aa77a9efbdf30a22dc"/>
+    <w:bookmarkEnd w:id="201"/>
+    <w:bookmarkStart w:id="202" w:name="X24eb9b3eb0d379335dea7aa77a9efbdf30a22dc"/>
     <w:p>
       <w:pPr>
         <w:pStyle w:val="Heading2"/>
@@ -23601,8 +23601,8 @@
         </w:tc>
       </w:tr>
     </w:tbl>
-    <w:bookmarkEnd w:id="182"/>
-    <w:bookmarkStart w:id="183" w:name="X4b7fa30a93af35a911e2150440f03e81fd9720c"/>
+    <w:bookmarkEnd w:id="202"/>
+    <w:bookmarkStart w:id="203" w:name="X4b7fa30a93af35a911e2150440f03e81fd9720c"/>
     <w:p>
       <w:pPr>
         <w:pStyle w:val="Heading2"/>
@@ -23775,8 +23775,8 @@
         <w:t xml:space="preserve">filter.</w:t>
       </w:r>
     </w:p>
-    <w:bookmarkEnd w:id="183"/>
-    <w:bookmarkStart w:id="186" w:name="related-documents"/>
+    <w:bookmarkEnd w:id="203"/>
+    <w:bookmarkStart w:id="206" w:name="related-documents"/>
     <w:p>
       <w:pPr>
         <w:pStyle w:val="Heading2"/>
@@ -23793,7 +23793,7 @@
           <w:numId w:val="1080"/>
         </w:numPr>
       </w:pPr>
-      <w:hyperlink r:id="rId103">
+      <w:hyperlink r:id="rId123">
         <w:r>
           <w:rPr>
             <w:rStyle w:val="Hyperlink"/>
@@ -23818,7 +23818,7 @@
           <w:numId w:val="1080"/>
         </w:numPr>
       </w:pPr>
-      <w:hyperlink r:id="rId184">
+      <w:hyperlink r:id="rId204">
         <w:r>
           <w:rPr>
             <w:rStyle w:val="Hyperlink"/>
@@ -23843,7 +23843,7 @@
           <w:numId w:val="1080"/>
         </w:numPr>
       </w:pPr>
-      <w:hyperlink r:id="rId79">
+      <w:hyperlink r:id="rId99">
         <w:r>
           <w:rPr>
             <w:rStyle w:val="Hyperlink"/>
@@ -23868,7 +23868,7 @@
           <w:numId w:val="1080"/>
         </w:numPr>
       </w:pPr>
-      <w:hyperlink r:id="rId87">
+      <w:hyperlink r:id="rId107">
         <w:r>
           <w:rPr>
             <w:rStyle w:val="Hyperlink"/>
@@ -23893,7 +23893,7 @@
           <w:numId w:val="1080"/>
         </w:numPr>
       </w:pPr>
-      <w:hyperlink r:id="rId185">
+      <w:hyperlink r:id="rId205">
         <w:r>
           <w:rPr>
             <w:rStyle w:val="Hyperlink"/>
@@ -23910,8 +23910,8 @@
         <w:t xml:space="preserve">— The official upstream document describing WordPress core security architecture, maintained at WordPress.org.</w:t>
       </w:r>
     </w:p>
-    <w:bookmarkEnd w:id="186"/>
-    <w:bookmarkStart w:id="188" w:name="license-and-attribution"/>
+    <w:bookmarkEnd w:id="206"/>
+    <w:bookmarkStart w:id="208" w:name="license-and-attribution"/>
     <w:p>
       <w:pPr>
         <w:pStyle w:val="Heading2"/>
@@ -23930,7 +23930,7 @@
       <w:r>
         <w:t xml:space="preserve"> </w:t>
       </w:r>
-      <w:hyperlink r:id="rId187">
+      <w:hyperlink r:id="rId207">
         <w:r>
           <w:rPr>
             <w:rStyle w:val="Hyperlink"/>
@@ -23960,9 +23960,9 @@
         <w:t xml:space="preserve">The format of this benchmark is adapted from industry-standard benchmarks published by the Center for Internet Security (CIS). Technical guidance draws on the OWASP Top 10 (2025), NIST SP 800-63B, the Verizon Data Breach Investigations Report (2025), and IBM’s Cost of a Data Breach Report (2025).</w:t>
       </w:r>
     </w:p>
-    <w:bookmarkEnd w:id="188"/>
+    <w:bookmarkEnd w:id="208"/>
     <w:sectPr>
-      <w:footerReference r:id="rId9" w:type="default"/>
+      <w:footerReference r:id="rId31" w:type="default"/>
       <w:footnotePr>
         <w:numRestart w:val="eachSect"/>
       </w:footnotePr>

</xml_diff>